<commit_message>
handout: the metrics first — a stat-tile row under the title, bold figures in the table
Co-Authored-By: Claude Fable 5.1 <noreply@anthropic.com>
Claude-Session: https://claude.ai/code/session_01Bx85pVAQX8zwANx8Vu9Jwo
</commit_message>
<xml_diff>
--- a/demo/handout/the-missing-band.docx
+++ b/demo/handout/the-missing-band.docx
@@ -40,6 +40,354 @@
           <w:bottom w:val="single" w:color="C9CED6" w:sz="6" w:space="1"/>
         </w:pBdr>
         <w:spacing w:after="80" w:before="0"/>
+      </w:pPr>
+    </w:p>
+    <w:tbl>
+      <w:tblPr>
+        <w:tblW w:type="dxa" w:w="9860"/>
+        <w:tblBorders>
+          <w:top w:val="none" w:color="FFFFFF" w:sz="0"/>
+          <w:left w:val="none" w:color="FFFFFF" w:sz="0"/>
+          <w:bottom w:val="none" w:color="FFFFFF" w:sz="0"/>
+          <w:right w:val="none" w:color="FFFFFF" w:sz="0"/>
+          <w:insideH w:val="none" w:color="FFFFFF" w:sz="0"/>
+          <w:insideV w:val="none" w:color="FFFFFF" w:sz="0"/>
+        </w:tblBorders>
+      </w:tblPr>
+      <w:tblGrid>
+        <w:gridCol w:w="2375"/>
+        <w:gridCol w:w="120"/>
+        <w:gridCol w:w="2375"/>
+        <w:gridCol w:w="120"/>
+        <w:gridCol w:w="2375"/>
+        <w:gridCol w:w="120"/>
+        <w:gridCol w:w="2375"/>
+      </w:tblGrid>
+      <w:tr>
+        <w:tc>
+          <w:tcPr>
+            <w:tcW w:type="dxa" w:w="2375"/>
+            <w:tcBorders>
+              <w:top w:val="single" w:color="B86E00" w:sz="18"/>
+              <w:left w:val="none" w:color="FFFFFF" w:sz="0"/>
+              <w:bottom w:val="none" w:color="FFFFFF" w:sz="0"/>
+              <w:right w:val="none" w:color="FFFFFF" w:sz="0"/>
+            </w:tcBorders>
+            <w:shd w:fill="F3F4F6" w:color="auto" w:val="clear"/>
+            <w:tcMar>
+              <w:top w:type="dxa" w:w="70"/>
+              <w:left w:type="dxa" w:w="140"/>
+              <w:bottom w:type="dxa" w:w="80"/>
+              <w:right w:type="dxa" w:w="100"/>
+            </w:tcMar>
+          </w:tcPr>
+          <w:p>
+            <w:pPr>
+              <w:keepLines/>
+              <w:spacing w:after="0" w:before="0" w:line="220"/>
+            </w:pPr>
+            <w:r>
+              <w:rPr>
+                <w:rFonts w:ascii="Arial" w:cs="Arial" w:eastAsia="Yu Gothic" w:hAnsi="Arial"/>
+                <w:color w:val="5A6270"/>
+                <w:sz w:val="14"/>
+                <w:szCs w:val="14"/>
+              </w:rPr>
+              <w:t xml:space="preserve">High-band deficit, one draw</w:t>
+            </w:r>
+          </w:p>
+          <w:p>
+            <w:pPr>
+              <w:keepLines/>
+              <w:spacing w:after="20" w:before="40" w:line="300"/>
+            </w:pPr>
+            <w:r>
+              <w:rPr>
+                <w:rFonts w:ascii="Arial" w:cs="Arial" w:eastAsia="Yu Gothic" w:hAnsi="Arial"/>
+                <w:b/>
+                <w:bCs/>
+                <w:color w:val="111318"/>
+                <w:sz w:val="38"/>
+                <w:szCs w:val="38"/>
+              </w:rPr>
+              <w:t xml:space="preserve">−6.85 dB</w:t>
+            </w:r>
+          </w:p>
+          <w:p>
+            <w:pPr>
+              <w:keepLines/>
+              <w:spacing w:after="0" w:before="0" w:line="220"/>
+            </w:pPr>
+            <w:r>
+              <w:rPr>
+                <w:rFonts w:ascii="Arial" w:cs="Arial" w:eastAsia="Yu Gothic" w:hAnsi="Arial"/>
+                <w:b/>
+                <w:bCs/>
+                <w:color w:val="1E7A46"/>
+                <w:sz w:val="14"/>
+                <w:szCs w:val="14"/>
+              </w:rPr>
+              <w:t xml:space="preserve">+5.8 dB vs det (−12.61)</w:t>
+            </w:r>
+          </w:p>
+        </w:tc>
+        <w:tc>
+          <w:tcPr>
+            <w:tcW w:type="dxa" w:w="120"/>
+            <w:tcBorders>
+              <w:top w:val="none" w:color="FFFFFF" w:sz="0"/>
+              <w:left w:val="none" w:color="FFFFFF" w:sz="0"/>
+              <w:bottom w:val="none" w:color="FFFFFF" w:sz="0"/>
+              <w:right w:val="none" w:color="FFFFFF" w:sz="0"/>
+            </w:tcBorders>
+          </w:tcPr>
+          <w:p>
+            <w:pPr>
+              <w:keepLines/>
+              <w:spacing w:after="0" w:before="0" w:line="252"/>
+            </w:pPr>
+          </w:p>
+        </w:tc>
+        <w:tc>
+          <w:tcPr>
+            <w:tcW w:type="dxa" w:w="2375"/>
+            <w:tcBorders>
+              <w:top w:val="single" w:color="B86E00" w:sz="18"/>
+              <w:left w:val="none" w:color="FFFFFF" w:sz="0"/>
+              <w:bottom w:val="none" w:color="FFFFFF" w:sz="0"/>
+              <w:right w:val="none" w:color="FFFFFF" w:sz="0"/>
+            </w:tcBorders>
+            <w:shd w:fill="F3F4F6" w:color="auto" w:val="clear"/>
+            <w:tcMar>
+              <w:top w:type="dxa" w:w="70"/>
+              <w:left w:type="dxa" w:w="140"/>
+              <w:bottom w:type="dxa" w:w="80"/>
+              <w:right w:type="dxa" w:w="100"/>
+            </w:tcMar>
+          </w:tcPr>
+          <w:p>
+            <w:pPr>
+              <w:keepLines/>
+              <w:spacing w:after="0" w:before="0" w:line="220"/>
+            </w:pPr>
+            <w:r>
+              <w:rPr>
+                <w:rFonts w:ascii="Arial" w:cs="Arial" w:eastAsia="Yu Gothic" w:hAnsi="Arial"/>
+                <w:color w:val="5A6270"/>
+                <w:sz w:val="14"/>
+                <w:szCs w:val="14"/>
+              </w:rPr>
+              <w:t xml:space="preserve">CRPS, high-band log|STFT|</w:t>
+            </w:r>
+          </w:p>
+          <w:p>
+            <w:pPr>
+              <w:keepLines/>
+              <w:spacing w:after="20" w:before="40" w:line="300"/>
+            </w:pPr>
+            <w:r>
+              <w:rPr>
+                <w:rFonts w:ascii="Arial" w:cs="Arial" w:eastAsia="Yu Gothic" w:hAnsi="Arial"/>
+                <w:b/>
+                <w:bCs/>
+                <w:color w:val="111318"/>
+                <w:sz w:val="38"/>
+                <w:szCs w:val="38"/>
+              </w:rPr>
+              <w:t xml:space="preserve">0.570</w:t>
+            </w:r>
+          </w:p>
+          <w:p>
+            <w:pPr>
+              <w:keepLines/>
+              <w:spacing w:after="0" w:before="0" w:line="220"/>
+            </w:pPr>
+            <w:r>
+              <w:rPr>
+                <w:rFonts w:ascii="Arial" w:cs="Arial" w:eastAsia="Yu Gothic" w:hAnsi="Arial"/>
+                <w:b/>
+                <w:bCs/>
+                <w:color w:val="1E7A46"/>
+                <w:sz w:val="14"/>
+                <w:szCs w:val="14"/>
+              </w:rPr>
+              <w:t xml:space="preserve">−41 % vs det (0.960)</w:t>
+            </w:r>
+          </w:p>
+        </w:tc>
+        <w:tc>
+          <w:tcPr>
+            <w:tcW w:type="dxa" w:w="120"/>
+            <w:tcBorders>
+              <w:top w:val="none" w:color="FFFFFF" w:sz="0"/>
+              <w:left w:val="none" w:color="FFFFFF" w:sz="0"/>
+              <w:bottom w:val="none" w:color="FFFFFF" w:sz="0"/>
+              <w:right w:val="none" w:color="FFFFFF" w:sz="0"/>
+            </w:tcBorders>
+          </w:tcPr>
+          <w:p>
+            <w:pPr>
+              <w:keepLines/>
+              <w:spacing w:after="0" w:before="0" w:line="252"/>
+            </w:pPr>
+          </w:p>
+        </w:tc>
+        <w:tc>
+          <w:tcPr>
+            <w:tcW w:type="dxa" w:w="2375"/>
+            <w:tcBorders>
+              <w:top w:val="single" w:color="B86E00" w:sz="18"/>
+              <w:left w:val="none" w:color="FFFFFF" w:sz="0"/>
+              <w:bottom w:val="none" w:color="FFFFFF" w:sz="0"/>
+              <w:right w:val="none" w:color="FFFFFF" w:sz="0"/>
+            </w:tcBorders>
+            <w:shd w:fill="F3F4F6" w:color="auto" w:val="clear"/>
+            <w:tcMar>
+              <w:top w:type="dxa" w:w="70"/>
+              <w:left w:type="dxa" w:w="140"/>
+              <w:bottom w:type="dxa" w:w="80"/>
+              <w:right w:type="dxa" w:w="100"/>
+            </w:tcMar>
+          </w:tcPr>
+          <w:p>
+            <w:pPr>
+              <w:keepLines/>
+              <w:spacing w:after="0" w:before="0" w:line="220"/>
+            </w:pPr>
+            <w:r>
+              <w:rPr>
+                <w:rFonts w:ascii="Arial" w:cs="Arial" w:eastAsia="Yu Gothic" w:hAnsi="Arial"/>
+                <w:color w:val="5A6270"/>
+                <w:sz w:val="14"/>
+                <w:szCs w:val="14"/>
+              </w:rPr>
+              <w:t xml:space="preserve">LSD, log-mean of 16 draws</w:t>
+            </w:r>
+          </w:p>
+          <w:p>
+            <w:pPr>
+              <w:keepLines/>
+              <w:spacing w:after="20" w:before="40" w:line="300"/>
+            </w:pPr>
+            <w:r>
+              <w:rPr>
+                <w:rFonts w:ascii="Arial" w:cs="Arial" w:eastAsia="Yu Gothic" w:hAnsi="Arial"/>
+                <w:b/>
+                <w:bCs/>
+                <w:color w:val="111318"/>
+                <w:sz w:val="38"/>
+                <w:szCs w:val="38"/>
+              </w:rPr>
+              <w:t xml:space="preserve">0.835</w:t>
+            </w:r>
+          </w:p>
+          <w:p>
+            <w:pPr>
+              <w:keepLines/>
+              <w:spacing w:after="0" w:before="0" w:line="220"/>
+            </w:pPr>
+            <w:r>
+              <w:rPr>
+                <w:rFonts w:ascii="Arial" w:cs="Arial" w:eastAsia="Yu Gothic" w:hAnsi="Arial"/>
+                <w:b/>
+                <w:bCs/>
+                <w:color w:val="1E7A46"/>
+                <w:sz w:val="14"/>
+                <w:szCs w:val="14"/>
+              </w:rPr>
+              <w:t xml:space="preserve">−0.08 vs det (0.910)</w:t>
+            </w:r>
+          </w:p>
+        </w:tc>
+        <w:tc>
+          <w:tcPr>
+            <w:tcW w:type="dxa" w:w="120"/>
+            <w:tcBorders>
+              <w:top w:val="none" w:color="FFFFFF" w:sz="0"/>
+              <w:left w:val="none" w:color="FFFFFF" w:sz="0"/>
+              <w:bottom w:val="none" w:color="FFFFFF" w:sz="0"/>
+              <w:right w:val="none" w:color="FFFFFF" w:sz="0"/>
+            </w:tcBorders>
+          </w:tcPr>
+          <w:p>
+            <w:pPr>
+              <w:keepLines/>
+              <w:spacing w:after="0" w:before="0" w:line="252"/>
+            </w:pPr>
+          </w:p>
+        </w:tc>
+        <w:tc>
+          <w:tcPr>
+            <w:tcW w:type="dxa" w:w="2375"/>
+            <w:tcBorders>
+              <w:top w:val="single" w:color="B86E00" w:sz="18"/>
+              <w:left w:val="none" w:color="FFFFFF" w:sz="0"/>
+              <w:bottom w:val="none" w:color="FFFFFF" w:sz="0"/>
+              <w:right w:val="none" w:color="FFFFFF" w:sz="0"/>
+            </w:tcBorders>
+            <w:shd w:fill="F3F4F6" w:color="auto" w:val="clear"/>
+            <w:tcMar>
+              <w:top w:type="dxa" w:w="70"/>
+              <w:left w:type="dxa" w:w="140"/>
+              <w:bottom w:type="dxa" w:w="80"/>
+              <w:right w:type="dxa" w:w="100"/>
+            </w:tcMar>
+          </w:tcPr>
+          <w:p>
+            <w:pPr>
+              <w:keepLines/>
+              <w:spacing w:after="0" w:before="0" w:line="220"/>
+            </w:pPr>
+            <w:r>
+              <w:rPr>
+                <w:rFonts w:ascii="Arial" w:cs="Arial" w:eastAsia="Yu Gothic" w:hAnsi="Arial"/>
+                <w:color w:val="5A6270"/>
+                <w:sz w:val="14"/>
+                <w:szCs w:val="14"/>
+              </w:rPr>
+              <w:t xml:space="preserve">Cost per second of audio</w:t>
+            </w:r>
+          </w:p>
+          <w:p>
+            <w:pPr>
+              <w:keepLines/>
+              <w:spacing w:after="20" w:before="40" w:line="300"/>
+            </w:pPr>
+            <w:r>
+              <w:rPr>
+                <w:rFonts w:ascii="Arial" w:cs="Arial" w:eastAsia="Yu Gothic" w:hAnsi="Arial"/>
+                <w:b/>
+                <w:bCs/>
+                <w:color w:val="111318"/>
+                <w:sz w:val="38"/>
+                <w:szCs w:val="38"/>
+              </w:rPr>
+              <w:t xml:space="preserve">15.9 ms</w:t>
+            </w:r>
+          </w:p>
+          <w:p>
+            <w:pPr>
+              <w:keepLines/>
+              <w:spacing w:after="0" w:before="0" w:line="220"/>
+            </w:pPr>
+            <w:r>
+              <w:rPr>
+                <w:rFonts w:ascii="Arial" w:cs="Arial" w:eastAsia="Yu Gothic" w:hAnsi="Arial"/>
+                <w:b w:val="false"/>
+                <w:bCs w:val="false"/>
+                <w:color w:val="5A6270"/>
+                <w:sz w:val="14"/>
+                <w:szCs w:val="14"/>
+              </w:rPr>
+              <w:t xml:space="preserve">63× realtime · Apple M4 CPU</w:t>
+            </w:r>
+          </w:p>
+        </w:tc>
+      </w:tr>
+    </w:tbl>
+    <w:p>
+      <w:pPr>
+        <w:spacing w:after="0" w:before="0" w:line="140" w:lineRule="exact"/>
       </w:pPr>
     </w:p>
     <w:tbl>
@@ -89,7 +437,7 @@
           <w:p>
             <w:pPr>
               <w:keepLines/>
-              <w:spacing w:after="0" w:before="0" w:line="300"/>
+              <w:spacing w:after="0" w:before="0" w:line="290"/>
             </w:pPr>
             <w:r>
               <w:rPr>
@@ -106,8 +454,7 @@
     </w:tbl>
     <w:p>
       <w:pPr>
-        <w:keepLines/>
-        <w:spacing w:after="20" w:before="0" w:line="252"/>
+        <w:spacing w:after="0" w:before="0" w:line="80" w:lineRule="exact"/>
       </w:pPr>
     </w:p>
     <w:p>
@@ -140,7 +487,27 @@
           <w:sz w:val="17"/>
           <w:szCs w:val="17"/>
         </w:rPr>
-        <w:t xml:space="preserve">LISA (ICASSP 2022) is a small audio super-resolution network: 12 kHz in, 48 kHz out, 86,881 parameters as reimplemented here. It is trained with a deterministic loss on a one-to-many problem, so its minimiser is the conditional mean — and the mean of a random-phase high band has no energy. The output is muffled. That is not a bug in the model; it is what the objective asks for. LISA's own configuration (</w:t>
+        <w:t xml:space="preserve">LISA (ICASSP 2022) is a small audio super-resolution network: 12 kHz in, 48 kHz out, </w:t>
+      </w:r>
+      <w:r>
+        <w:rPr>
+          <w:rFonts w:ascii="Arial" w:cs="Arial" w:eastAsia="Yu Gothic" w:hAnsi="Arial"/>
+          <w:b/>
+          <w:bCs/>
+          <w:color w:val="111318"/>
+          <w:sz w:val="17"/>
+          <w:szCs w:val="17"/>
+        </w:rPr>
+        <w:t xml:space="preserve">86,881</w:t>
+      </w:r>
+      <w:r>
+        <w:rPr>
+          <w:rFonts w:ascii="Arial" w:cs="Arial" w:eastAsia="Yu Gothic" w:hAnsi="Arial"/>
+          <w:color w:val="111318"/>
+          <w:sz w:val="17"/>
+          <w:szCs w:val="17"/>
+        </w:rPr>
+        <w:t xml:space="preserve"> parameters as reimplemented here. It is trained with a deterministic loss on a one-to-many problem, so its minimiser is the conditional mean — and the mean of a random-phase high band has no energy. The output is muffled. That is not a bug in the model; it is what the objective asks for. LISA's own configuration (</w:t>
       </w:r>
       <w:r>
         <w:rPr>
@@ -211,7 +578,47 @@
           <w:sz w:val="17"/>
           <w:szCs w:val="17"/>
         </w:rPr>
-        <w:t xml:space="preserve">Concatenate eight Gaussian channels to the waveform at the encoder input (+896 weights, 87,777 parameters) and train the same network under the </w:t>
+        <w:t xml:space="preserve">Concatenate eight Gaussian channels to the waveform at the encoder input (</w:t>
+      </w:r>
+      <w:r>
+        <w:rPr>
+          <w:rFonts w:ascii="Arial" w:cs="Arial" w:eastAsia="Yu Gothic" w:hAnsi="Arial"/>
+          <w:b/>
+          <w:bCs/>
+          <w:color w:val="111318"/>
+          <w:sz w:val="17"/>
+          <w:szCs w:val="17"/>
+        </w:rPr>
+        <w:t xml:space="preserve">+896</w:t>
+      </w:r>
+      <w:r>
+        <w:rPr>
+          <w:rFonts w:ascii="Arial" w:cs="Arial" w:eastAsia="Yu Gothic" w:hAnsi="Arial"/>
+          <w:color w:val="111318"/>
+          <w:sz w:val="17"/>
+          <w:szCs w:val="17"/>
+        </w:rPr>
+        <w:t xml:space="preserve"> weights, </w:t>
+      </w:r>
+      <w:r>
+        <w:rPr>
+          <w:rFonts w:ascii="Arial" w:cs="Arial" w:eastAsia="Yu Gothic" w:hAnsi="Arial"/>
+          <w:b/>
+          <w:bCs/>
+          <w:color w:val="111318"/>
+          <w:sz w:val="17"/>
+          <w:szCs w:val="17"/>
+        </w:rPr>
+        <w:t xml:space="preserve">87,777</w:t>
+      </w:r>
+      <w:r>
+        <w:rPr>
+          <w:rFonts w:ascii="Arial" w:cs="Arial" w:eastAsia="Yu Gothic" w:hAnsi="Arial"/>
+          <w:color w:val="111318"/>
+          <w:sz w:val="17"/>
+          <w:szCs w:val="17"/>
+        </w:rPr>
+        <w:t xml:space="preserve"> parameters) and train the same network under the </w:t>
       </w:r>
       <w:r>
         <w:rPr>
@@ -231,7 +638,27 @@
           <w:sz w:val="17"/>
           <w:szCs w:val="17"/>
         </w:rPr>
-        <w:t xml:space="preserve">, two draws per step, on a distance that combines waveform L1 with a spectral term. The score is strictly proper, so the minimiser is p(y|x) rather than its mean. One forward pass is one sample; sixteen give the spread; with the noise at zero the network is LISA exactly. No discriminator, no diffusion, no second network. The recipe follows DISCO Nets (2016) and Gritsenko et al. (2020); new here are the target, the stochastic local implicit decoder and the diagnostics.</w:t>
+        <w:t xml:space="preserve">, two draws per step, on a distance that combines waveform L1 with a spectral term. The score is strictly proper, so the minimiser is p(y|x) rather than its mean. One forward pass is one sample; </w:t>
+      </w:r>
+      <w:r>
+        <w:rPr>
+          <w:rFonts w:ascii="Arial" w:cs="Arial" w:eastAsia="Yu Gothic" w:hAnsi="Arial"/>
+          <w:b/>
+          <w:bCs/>
+          <w:color w:val="111318"/>
+          <w:sz w:val="17"/>
+          <w:szCs w:val="17"/>
+        </w:rPr>
+        <w:t xml:space="preserve">sixteen</w:t>
+      </w:r>
+      <w:r>
+        <w:rPr>
+          <w:rFonts w:ascii="Arial" w:cs="Arial" w:eastAsia="Yu Gothic" w:hAnsi="Arial"/>
+          <w:color w:val="111318"/>
+          <w:sz w:val="17"/>
+          <w:szCs w:val="17"/>
+        </w:rPr>
+        <w:t xml:space="preserve"> give the spread; with the noise at zero the network is LISA exactly. No discriminator, no diffusion, no second network. The recipe follows DISCO Nets (2016) and Gritsenko et al. (2020); new here are the target, the stochastic local implicit decoder and the diagnostics.</w:t>
       </w:r>
     </w:p>
     <w:p>
@@ -264,7 +691,47 @@
           <w:sz w:val="17"/>
           <w:szCs w:val="17"/>
         </w:rPr>
-        <w:t xml:space="preserve">Every figure is from the run's own evaluation, the JSON the demo reads: twelve held-out utterances of one speaker (p236), never trained on, 16 draws each. </w:t>
+        <w:t xml:space="preserve">Run OV50, read by the demo from one JSON: twelve held-out utterances of one speaker (</w:t>
+      </w:r>
+      <w:r>
+        <w:rPr>
+          <w:rFonts w:ascii="Arial" w:cs="Arial" w:eastAsia="Yu Gothic" w:hAnsi="Arial"/>
+          <w:b/>
+          <w:bCs/>
+          <w:color w:val="111318"/>
+          <w:sz w:val="17"/>
+          <w:szCs w:val="17"/>
+        </w:rPr>
+        <w:t xml:space="preserve">p236</w:t>
+      </w:r>
+      <w:r>
+        <w:rPr>
+          <w:rFonts w:ascii="Arial" w:cs="Arial" w:eastAsia="Yu Gothic" w:hAnsi="Arial"/>
+          <w:color w:val="111318"/>
+          <w:sz w:val="17"/>
+          <w:szCs w:val="17"/>
+        </w:rPr>
+        <w:t xml:space="preserve">), never trained on, </w:t>
+      </w:r>
+      <w:r>
+        <w:rPr>
+          <w:rFonts w:ascii="Arial" w:cs="Arial" w:eastAsia="Yu Gothic" w:hAnsi="Arial"/>
+          <w:b/>
+          <w:bCs/>
+          <w:color w:val="111318"/>
+          <w:sz w:val="17"/>
+          <w:szCs w:val="17"/>
+        </w:rPr>
+        <w:t xml:space="preserve">16 draws</w:t>
+      </w:r>
+      <w:r>
+        <w:rPr>
+          <w:rFonts w:ascii="Arial" w:cs="Arial" w:eastAsia="Yu Gothic" w:hAnsi="Arial"/>
+          <w:color w:val="111318"/>
+          <w:sz w:val="17"/>
+          <w:szCs w:val="17"/>
+        </w:rPr>
+        <w:t xml:space="preserve"> each. </w:t>
       </w:r>
       <w:r>
         <w:rPr>
@@ -318,7 +785,7 @@
           <w:sz w:val="14"/>
           <w:szCs w:val="14"/>
         </w:rPr>
-        <w:t xml:space="preserve">Run OV50, EVAL12: 12 held-out utterances of p236, 16 draws, 104,950 steps. LSD in the repo's convention (decades of power, not dB) at the passthrough readout each arm wins ViSQOL on. Cost: one pass over 1 s of audio on an Apple M4 CPU, 8 threads, fp32.</w:t>
+        <w:t xml:space="preserve">EVAL12: 12 held-out utterances of p236, 16 draws, 104,950 steps. LSD in the repo's convention (decades of power, not dB) at the passthrough readout each arm wins ViSQOL on. Cost: one pass over 1 s of audio, Apple M4 CPU, 8 threads, fp32.</w:t>
       </w:r>
     </w:p>
     <w:tbl>
@@ -489,6 +956,7 @@
         <w:tc>
           <w:tcPr>
             <w:tcW w:type="dxa" w:w="3350"/>
+            <w:shd w:fill="FFF7EA" w:color="auto" w:val="clear"/>
             <w:tcMar>
               <w:top w:type="dxa" w:w="40"/>
               <w:left w:type="dxa" w:w="90"/>
@@ -506,11 +974,11 @@
             <w:r>
               <w:rPr>
                 <w:rFonts w:ascii="Consolas" w:cs="Consolas" w:eastAsia="Yu Gothic" w:hAnsi="Consolas"/>
-                <w:b w:val="false"/>
-                <w:bCs w:val="false"/>
-                <w:color w:val="111318"/>
-                <w:sz w:val="15"/>
-                <w:szCs w:val="15"/>
+                <w:b/>
+                <w:bCs/>
+                <w:color w:val="111318"/>
+                <w:sz w:val="17"/>
+                <w:szCs w:val="17"/>
               </w:rPr>
               <w:t xml:space="preserve">−6.85 dB</w:t>
             </w:r>
@@ -581,6 +1049,7 @@
         <w:tc>
           <w:tcPr>
             <w:tcW w:type="dxa" w:w="3350"/>
+            <w:shd w:fill="FFF7EA" w:color="auto" w:val="clear"/>
             <w:tcMar>
               <w:top w:type="dxa" w:w="40"/>
               <w:left w:type="dxa" w:w="90"/>
@@ -598,13 +1067,24 @@
             <w:r>
               <w:rPr>
                 <w:rFonts w:ascii="Consolas" w:cs="Consolas" w:eastAsia="Yu Gothic" w:hAnsi="Consolas"/>
+                <w:b/>
+                <w:bCs/>
+                <w:color w:val="111318"/>
+                <w:sz w:val="17"/>
+                <w:szCs w:val="17"/>
+              </w:rPr>
+              <w:t xml:space="preserve">0.570</w:t>
+            </w:r>
+            <w:r>
+              <w:rPr>
+                <w:rFonts w:ascii="Consolas" w:cs="Consolas" w:eastAsia="Yu Gothic" w:hAnsi="Consolas"/>
                 <w:b w:val="false"/>
                 <w:bCs w:val="false"/>
                 <w:color w:val="111318"/>
-                <w:sz w:val="15"/>
-                <w:szCs w:val="15"/>
-              </w:rPr>
-              <w:t xml:space="preserve">0.570  (−41 %)</w:t>
+                <w:sz w:val="17"/>
+                <w:szCs w:val="17"/>
+              </w:rPr>
+              <w:t xml:space="preserve">  (−41 %)</w:t>
             </w:r>
           </w:p>
         </w:tc>
@@ -673,6 +1153,7 @@
         <w:tc>
           <w:tcPr>
             <w:tcW w:type="dxa" w:w="3350"/>
+            <w:shd w:fill="FFF7EA" w:color="auto" w:val="clear"/>
             <w:tcMar>
               <w:top w:type="dxa" w:w="40"/>
               <w:left w:type="dxa" w:w="90"/>
@@ -690,13 +1171,24 @@
             <w:r>
               <w:rPr>
                 <w:rFonts w:ascii="Consolas" w:cs="Consolas" w:eastAsia="Yu Gothic" w:hAnsi="Consolas"/>
+                <w:b/>
+                <w:bCs/>
+                <w:color w:val="111318"/>
+                <w:sz w:val="17"/>
+                <w:szCs w:val="17"/>
+              </w:rPr>
+              <w:t xml:space="preserve">0.835</w:t>
+            </w:r>
+            <w:r>
+              <w:rPr>
+                <w:rFonts w:ascii="Consolas" w:cs="Consolas" w:eastAsia="Yu Gothic" w:hAnsi="Consolas"/>
                 <w:b w:val="false"/>
                 <w:bCs w:val="false"/>
                 <w:color w:val="111318"/>
-                <w:sz w:val="15"/>
-                <w:szCs w:val="15"/>
-              </w:rPr>
-              <w:t xml:space="preserve">0.835  (log-mean of 16)</w:t>
+                <w:sz w:val="17"/>
+                <w:szCs w:val="17"/>
+              </w:rPr>
+              <w:t xml:space="preserve">  (log-mean of 16)</w:t>
             </w:r>
           </w:p>
         </w:tc>
@@ -765,6 +1257,7 @@
         <w:tc>
           <w:tcPr>
             <w:tcW w:type="dxa" w:w="3350"/>
+            <w:shd w:fill="FFF7EA" w:color="auto" w:val="clear"/>
             <w:tcMar>
               <w:top w:type="dxa" w:w="40"/>
               <w:left w:type="dxa" w:w="90"/>
@@ -782,13 +1275,24 @@
             <w:r>
               <w:rPr>
                 <w:rFonts w:ascii="Consolas" w:cs="Consolas" w:eastAsia="Yu Gothic" w:hAnsi="Consolas"/>
+                <w:b/>
+                <w:bCs/>
+                <w:color w:val="111318"/>
+                <w:sz w:val="17"/>
+                <w:szCs w:val="17"/>
+              </w:rPr>
+              <w:t xml:space="preserve">3.02</w:t>
+            </w:r>
+            <w:r>
+              <w:rPr>
+                <w:rFonts w:ascii="Consolas" w:cs="Consolas" w:eastAsia="Yu Gothic" w:hAnsi="Consolas"/>
                 <w:b w:val="false"/>
                 <w:bCs w:val="false"/>
                 <w:color w:val="111318"/>
-                <w:sz w:val="15"/>
-                <w:szCs w:val="15"/>
-              </w:rPr>
-              <w:t xml:space="preserve">3.02  (0.6 % of range)</w:t>
+                <w:sz w:val="17"/>
+                <w:szCs w:val="17"/>
+              </w:rPr>
+              <w:t xml:space="preserve">  (0.6 % of range)</w:t>
             </w:r>
           </w:p>
         </w:tc>
@@ -843,7 +1347,7 @@
             </w:pPr>
             <w:r>
               <w:rPr>
-                <w:rFonts w:ascii="Arial" w:cs="Arial" w:eastAsia="Yu Gothic" w:hAnsi="Arial"/>
+                <w:rFonts w:ascii="Consolas" w:cs="Consolas" w:eastAsia="Yu Gothic" w:hAnsi="Consolas"/>
                 <w:b w:val="false"/>
                 <w:bCs w:val="false"/>
                 <w:color w:val="111318"/>
@@ -857,6 +1361,7 @@
         <w:tc>
           <w:tcPr>
             <w:tcW w:type="dxa" w:w="3350"/>
+            <w:shd w:fill="FFF7EA" w:color="auto" w:val="clear"/>
             <w:tcMar>
               <w:top w:type="dxa" w:w="40"/>
               <w:left w:type="dxa" w:w="90"/>
@@ -874,13 +1379,24 @@
             <w:r>
               <w:rPr>
                 <w:rFonts w:ascii="Consolas" w:cs="Consolas" w:eastAsia="Yu Gothic" w:hAnsi="Consolas"/>
+                <w:b/>
+                <w:bCs/>
+                <w:color w:val="111318"/>
+                <w:sz w:val="17"/>
+                <w:szCs w:val="17"/>
+              </w:rPr>
+              <w:t xml:space="preserve">0.182</w:t>
+            </w:r>
+            <w:r>
+              <w:rPr>
+                <w:rFonts w:ascii="Consolas" w:cs="Consolas" w:eastAsia="Yu Gothic" w:hAnsi="Consolas"/>
                 <w:b w:val="false"/>
                 <w:bCs w:val="false"/>
                 <w:color w:val="111318"/>
-                <w:sz w:val="15"/>
-                <w:szCs w:val="15"/>
-              </w:rPr>
-              <w:t xml:space="preserve">0.182  (1.55× ideal)</w:t>
+                <w:sz w:val="17"/>
+                <w:szCs w:val="17"/>
+              </w:rPr>
+              <w:t xml:space="preserve">  (1.55× ideal)</w:t>
             </w:r>
           </w:p>
         </w:tc>
@@ -949,6 +1465,7 @@
         <w:tc>
           <w:tcPr>
             <w:tcW w:type="dxa" w:w="3350"/>
+            <w:shd w:fill="FFF7EA" w:color="auto" w:val="clear"/>
             <w:tcMar>
               <w:top w:type="dxa" w:w="40"/>
               <w:left w:type="dxa" w:w="90"/>
@@ -966,13 +1483,24 @@
             <w:r>
               <w:rPr>
                 <w:rFonts w:ascii="Consolas" w:cs="Consolas" w:eastAsia="Yu Gothic" w:hAnsi="Consolas"/>
+                <w:b/>
+                <w:bCs/>
+                <w:color w:val="111318"/>
+                <w:sz w:val="17"/>
+                <w:szCs w:val="17"/>
+              </w:rPr>
+              <w:t xml:space="preserve">88,353 · 15.9 ms</w:t>
+            </w:r>
+            <w:r>
+              <w:rPr>
+                <w:rFonts w:ascii="Consolas" w:cs="Consolas" w:eastAsia="Yu Gothic" w:hAnsi="Consolas"/>
                 <w:b w:val="false"/>
                 <w:bCs w:val="false"/>
                 <w:color w:val="111318"/>
-                <w:sz w:val="15"/>
-                <w:szCs w:val="15"/>
-              </w:rPr>
-              <w:t xml:space="preserve">88,353 · 15.9 ms (63×)</w:t>
+                <w:sz w:val="17"/>
+                <w:szCs w:val="17"/>
+              </w:rPr>
+              <w:t xml:space="preserve"> (63×)</w:t>
             </w:r>
           </w:p>
         </w:tc>
@@ -980,8 +1508,7 @@
     </w:tbl>
     <w:p>
       <w:pPr>
-        <w:keepLines/>
-        <w:spacing w:after="20" w:before="0" w:line="252"/>
+        <w:spacing w:after="0" w:before="0" w:line="100" w:lineRule="exact"/>
       </w:pPr>
     </w:p>
     <w:p>
@@ -1014,7 +1541,7 @@
           <w:sz w:val="17"/>
           <w:szCs w:val="17"/>
         </w:rPr>
-        <w:t xml:space="preserve">Pick a speaker, a rate (×4 or ×8: the same weights queried at twice the density) and a model; the network runs in the browser. </w:t>
+        <w:t xml:space="preserve">Pick a speaker, a rate (×4 or ×8) and a model; the network runs in the browser. </w:t>
       </w:r>
       <w:r>
         <w:rPr>
@@ -1143,7 +1670,27 @@
           <w:sz w:val="16"/>
           <w:szCs w:val="16"/>
         </w:rPr>
-        <w:t xml:space="preserve"> PIT end bins are 1.55× ideal, almost all of it in the top bin: the truth sits above all sixteen draws more often than chance — a level bias, not a narrow ensemble. These are conditional predictors with usable spread, not calibrated conditional distributions.</w:t>
+        <w:t xml:space="preserve"> PIT end bins are </w:t>
+      </w:r>
+      <w:r>
+        <w:rPr>
+          <w:rFonts w:ascii="Arial" w:cs="Arial" w:eastAsia="Yu Gothic" w:hAnsi="Arial"/>
+          <w:b/>
+          <w:bCs/>
+          <w:color w:val="111318"/>
+          <w:sz w:val="16"/>
+          <w:szCs w:val="16"/>
+        </w:rPr>
+        <w:t xml:space="preserve">1.55×</w:t>
+      </w:r>
+      <w:r>
+        <w:rPr>
+          <w:rFonts w:ascii="Arial" w:cs="Arial" w:eastAsia="Yu Gothic" w:hAnsi="Arial"/>
+          <w:color w:val="111318"/>
+          <w:sz w:val="16"/>
+          <w:szCs w:val="16"/>
+        </w:rPr>
+        <w:t xml:space="preserve"> ideal, almost all of it in the top bin: the truth sits above all sixteen draws more often than chance — a level bias, not a narrow ensemble. Conditional predictors with usable spread, not calibrated conditional distributions.</w:t>
       </w:r>
     </w:p>
     <w:p>
@@ -1174,7 +1721,47 @@
           <w:sz w:val="16"/>
           <w:szCs w:val="16"/>
         </w:rPr>
-        <w:t xml:space="preserve"> Twelve utterances of one speaker; no FAD; no listening test. Part of the CRPS gain is definitional: a point forecast's CRPS is its MAE.</w:t>
+        <w:t xml:space="preserve"> </w:t>
+      </w:r>
+      <w:r>
+        <w:rPr>
+          <w:rFonts w:ascii="Arial" w:cs="Arial" w:eastAsia="Yu Gothic" w:hAnsi="Arial"/>
+          <w:b/>
+          <w:bCs/>
+          <w:color w:val="111318"/>
+          <w:sz w:val="16"/>
+          <w:szCs w:val="16"/>
+        </w:rPr>
+        <w:t xml:space="preserve">12</w:t>
+      </w:r>
+      <w:r>
+        <w:rPr>
+          <w:rFonts w:ascii="Arial" w:cs="Arial" w:eastAsia="Yu Gothic" w:hAnsi="Arial"/>
+          <w:color w:val="111318"/>
+          <w:sz w:val="16"/>
+          <w:szCs w:val="16"/>
+        </w:rPr>
+        <w:t xml:space="preserve"> utterances of </w:t>
+      </w:r>
+      <w:r>
+        <w:rPr>
+          <w:rFonts w:ascii="Arial" w:cs="Arial" w:eastAsia="Yu Gothic" w:hAnsi="Arial"/>
+          <w:b/>
+          <w:bCs/>
+          <w:color w:val="111318"/>
+          <w:sz w:val="16"/>
+          <w:szCs w:val="16"/>
+        </w:rPr>
+        <w:t xml:space="preserve">one</w:t>
+      </w:r>
+      <w:r>
+        <w:rPr>
+          <w:rFonts w:ascii="Arial" w:cs="Arial" w:eastAsia="Yu Gothic" w:hAnsi="Arial"/>
+          <w:color w:val="111318"/>
+          <w:sz w:val="16"/>
+          <w:szCs w:val="16"/>
+        </w:rPr>
+        <w:t xml:space="preserve"> speaker; no FAD; no listening test. Part of the CRPS gain is definitional: a point forecast's CRPS is its MAE.</w:t>
       </w:r>
     </w:p>
     <w:p>
@@ -1205,14 +1792,53 @@
           <w:sz w:val="16"/>
           <w:szCs w:val="16"/>
         </w:rPr>
-        <w:t xml:space="preserve"> LSD is computed differently in every paper and cannot be set against LISA's published 0.81. SNR is inert here: an empty high band scores 18.99 dB, above seven of the eight arms (the true band: 41.60 dB) — never rank on it.</w:t>
-      </w:r>
-    </w:p>
-    <w:p>
-      <w:pPr>
-        <w:keepNext/>
+        <w:t xml:space="preserve"> LSD is computed differently in every paper and cannot be set against LISA's published 0.81. SNR is inert here: an empty high band scores </w:t>
+      </w:r>
+      <w:r>
+        <w:rPr>
+          <w:rFonts w:ascii="Arial" w:cs="Arial" w:eastAsia="Yu Gothic" w:hAnsi="Arial"/>
+          <w:b/>
+          <w:bCs/>
+          <w:color w:val="111318"/>
+          <w:sz w:val="16"/>
+          <w:szCs w:val="16"/>
+        </w:rPr>
+        <w:t xml:space="preserve">18.99 dB</w:t>
+      </w:r>
+      <w:r>
+        <w:rPr>
+          <w:rFonts w:ascii="Arial" w:cs="Arial" w:eastAsia="Yu Gothic" w:hAnsi="Arial"/>
+          <w:color w:val="111318"/>
+          <w:sz w:val="16"/>
+          <w:szCs w:val="16"/>
+        </w:rPr>
+        <w:t xml:space="preserve">, above seven of the eight arms (the true band: </w:t>
+      </w:r>
+      <w:r>
+        <w:rPr>
+          <w:rFonts w:ascii="Arial" w:cs="Arial" w:eastAsia="Yu Gothic" w:hAnsi="Arial"/>
+          <w:b/>
+          <w:bCs/>
+          <w:color w:val="111318"/>
+          <w:sz w:val="16"/>
+          <w:szCs w:val="16"/>
+        </w:rPr>
+        <w:t xml:space="preserve">41.60 dB</w:t>
+      </w:r>
+      <w:r>
+        <w:rPr>
+          <w:rFonts w:ascii="Arial" w:cs="Arial" w:eastAsia="Yu Gothic" w:hAnsi="Arial"/>
+          <w:color w:val="111318"/>
+          <w:sz w:val="16"/>
+          <w:szCs w:val="16"/>
+        </w:rPr>
+        <w:t xml:space="preserve">) — never rank on it.</w:t>
+      </w:r>
+    </w:p>
+    <w:p>
+      <w:pPr>
         <w:keepLines/>
-        <w:spacing w:after="36" w:before="110" w:line="240"/>
+        <w:spacing w:after="0" w:before="90" w:line="220"/>
       </w:pPr>
       <w:r>
         <w:rPr>
@@ -1220,17 +1846,11 @@
           <w:b/>
           <w:bCs/>
           <w:color w:val="B86E00"/>
-          <w:sz w:val="15"/>
-          <w:szCs w:val="15"/>
-        </w:rPr>
-        <w:t xml:space="preserve">REFERENCES</w:t>
-      </w:r>
-    </w:p>
-    <w:p>
-      <w:pPr>
-        <w:keepLines/>
-        <w:spacing w:after="20" w:before="0" w:line="230"/>
-      </w:pPr>
+          <w:sz w:val="14"/>
+          <w:szCs w:val="14"/>
+        </w:rPr>
+        <w:t xml:space="preserve">References  </w:t>
+      </w:r>
       <w:r>
         <w:rPr>
           <w:rFonts w:ascii="Arial" w:cs="Arial" w:eastAsia="Yu Gothic" w:hAnsi="Arial"/>
@@ -1238,7 +1858,7 @@
           <w:sz w:val="14"/>
           <w:szCs w:val="14"/>
         </w:rPr>
-        <w:t xml:space="preserve">Kim, Lee, Hong, Ok. Learning Continuous Representation of Audio for Arbitrary Scale Super Resolution (LISA). ICASSP 2022, arXiv:2111.00195.  ·  DISCO Nets (2016).  ·  Gritsenko et al. (2020), the spectral energy distance.</w:t>
+        <w:t xml:space="preserve">Kim, Lee, Hong, Ok. Learning Continuous Representation of Audio for Arbitrary Scale Super Resolution (LISA), ICASSP 2022, arXiv:2111.00195  ·  DISCO Nets (2016)  ·  Gritsenko et al. (2020), the spectral energy distance</w:t>
       </w:r>
     </w:p>
     <w:sectPr>

</xml_diff>